<commit_message>
Added thesis and report
</commit_message>
<xml_diff>
--- a/docs/submissions/GROUP-E_report.docx
+++ b/docs/submissions/GROUP-E_report.docx
@@ -33,17 +33,154 @@
           <w:szCs w:val="40"/>
           <w:rtl w:val="0"/>
         </w:rPr>
-        <w:t xml:space="preserve">HYBRID TELECOM STREAM PROCESSING FRAMEWORK</w:t>
-      </w:r>
-      <w:r>
-        <w:rPr>
-          <w:rtl w:val="0"/>
-        </w:rPr>
-      </w:r>
-    </w:p>
-    <w:p>
-      <w:pPr>
-        <w:spacing w:after="400" w:lineRule="auto"/>
+        <w:t xml:space="preserve">DATA ANALYSIS OF STREAMING TELECOM TRAFFIC DATA USING DATA EXTRACTION SERVER IN A MESSAGE PASSING ENVIRONMENT</w:t>
+      </w:r>
+      <w:r>
+        <w:rPr>
+          <w:rtl w:val="0"/>
+        </w:rPr>
+      </w:r>
+    </w:p>
+    <w:p>
+      <w:pPr>
+        <w:spacing w:after="600" w:lineRule="auto"/>
+        <w:jc w:val="left"/>
+        <w:rPr>
+          <w:rFonts w:ascii="Calibri" w:cs="Calibri" w:eastAsia="Calibri" w:hAnsi="Calibri"/>
+          <w:b w:val="1"/>
+          <w:bCs w:val="1"/>
+          <w:sz w:val="26"/>
+          <w:szCs w:val="26"/>
+        </w:rPr>
+      </w:pPr>
+      <w:r>
+        <w:rPr>
+          <w:rtl w:val="0"/>
+        </w:rPr>
+      </w:r>
+    </w:p>
+    <w:p>
+      <w:pPr>
+        <w:spacing w:after="600" w:lineRule="auto"/>
+        <w:jc w:val="center"/>
+        <w:rPr>
+          <w:sz w:val="26"/>
+          <w:szCs w:val="26"/>
+        </w:rPr>
+      </w:pPr>
+      <w:r>
+        <w:rPr>
+          <w:rFonts w:ascii="Calibri" w:cs="Calibri" w:eastAsia="Calibri" w:hAnsi="Calibri"/>
+          <w:b w:val="1"/>
+          <w:bCs w:val="1"/>
+          <w:i w:val="0"/>
+          <w:iCs w:val="0"/>
+          <w:sz w:val="26"/>
+          <w:szCs w:val="26"/>
+          <w:rtl w:val="0"/>
+        </w:rPr>
+        <w:t xml:space="preserve">Summer Internship Project Report</w:t>
+      </w:r>
+      <w:r>
+        <w:rPr>
+          <w:rtl w:val="0"/>
+        </w:rPr>
+      </w:r>
+    </w:p>
+    <w:p>
+      <w:pPr>
+        <w:spacing w:after="300" w:lineRule="auto"/>
+        <w:jc w:val="center"/>
+        <w:rPr>
+          <w:rFonts w:ascii="Calibri" w:cs="Calibri" w:eastAsia="Calibri" w:hAnsi="Calibri"/>
+          <w:sz w:val="26"/>
+          <w:szCs w:val="26"/>
+        </w:rPr>
+      </w:pPr>
+      <w:r>
+        <w:rPr>
+          <w:rtl w:val="0"/>
+        </w:rPr>
+      </w:r>
+    </w:p>
+    <w:p>
+      <w:pPr>
+        <w:spacing w:after="300" w:lineRule="auto"/>
+        <w:jc w:val="center"/>
+        <w:rPr>
+          <w:sz w:val="26"/>
+          <w:szCs w:val="26"/>
+        </w:rPr>
+      </w:pPr>
+      <w:r>
+        <w:rPr>
+          <w:rFonts w:ascii="Calibri" w:cs="Calibri" w:eastAsia="Calibri" w:hAnsi="Calibri"/>
+          <w:b w:val="0"/>
+          <w:bCs w:val="0"/>
+          <w:i w:val="0"/>
+          <w:iCs w:val="0"/>
+          <w:sz w:val="26"/>
+          <w:szCs w:val="26"/>
+          <w:rtl w:val="0"/>
+        </w:rPr>
+        <w:t xml:space="preserve">by</w:t>
+      </w:r>
+      <w:r>
+        <w:rPr>
+          <w:rtl w:val="0"/>
+        </w:rPr>
+      </w:r>
+    </w:p>
+    <w:p>
+      <w:pPr>
+        <w:spacing w:after="120" w:lineRule="auto"/>
+        <w:jc w:val="center"/>
+        <w:rPr>
+          <w:sz w:val="26"/>
+          <w:szCs w:val="26"/>
+        </w:rPr>
+      </w:pPr>
+      <w:r>
+        <w:rPr>
+          <w:rFonts w:ascii="Calibri" w:cs="Calibri" w:eastAsia="Calibri" w:hAnsi="Calibri"/>
+          <w:b w:val="1"/>
+          <w:bCs w:val="1"/>
+          <w:i w:val="0"/>
+          <w:iCs w:val="0"/>
+          <w:sz w:val="26"/>
+          <w:szCs w:val="26"/>
+          <w:rtl w:val="0"/>
+        </w:rPr>
+        <w:t xml:space="preserve">Pathi Jahnavi (2023UCP1595) (Team Lead)</w:t>
+      </w:r>
+      <w:r>
+        <w:rPr>
+          <w:rtl w:val="0"/>
+        </w:rPr>
+      </w:r>
+    </w:p>
+    <w:p w14:paraId="00000008a">
+      <w:pPr>
+        <w:spacing w:after="120" w:lineRule="auto"/>
+        <w:jc w:val="center"/>
+        <w:rPr>
+          <w:sz w:val="26"/>
+          <w:szCs w:val="26"/>
+        </w:rPr>
+      </w:pPr>
+      <w:r>
+        <w:rPr>
+          <w:rFonts w:ascii="Calibri" w:cs="Calibri" w:eastAsia="Calibri" w:hAnsi="Calibri"/>
+          <w:sz w:val="26"/>
+          <w:szCs w:val="26"/>
+          <w:rtl w:val="0"/>
+        </w:rPr>
+        <w:t xml:space="preserve">B.Tech 3rd year CSE</w:t>
+      </w:r>
+    </w:p>
+    <w:p>
+      <w:pPr>
+        <w:spacing w:after="240" w:lineRule="auto"/>
         <w:jc w:val="center"/>
         <w:rPr>
           <w:sz w:val="26"/>
@@ -61,35 +198,17 @@
           <w:szCs w:val="26"/>
           <w:rtl w:val="0"/>
         </w:rPr>
-        <w:t xml:space="preserve">MPI-Based Multi-DES Communication for Distributed Telecom Packet Processing</w:t>
-      </w:r>
-      <w:r>
-        <w:rPr>
-          <w:rtl w:val="0"/>
-        </w:rPr>
-      </w:r>
-    </w:p>
-    <w:p>
-      <w:pPr>
-        <w:spacing w:after="600" w:lineRule="auto"/>
-        <w:jc w:val="left"/>
-        <w:rPr>
-          <w:rFonts w:ascii="Calibri" w:cs="Calibri" w:eastAsia="Calibri" w:hAnsi="Calibri"/>
-          <w:b w:val="1"/>
-          <w:bCs w:val="1"/>
-          <w:sz w:val="26"/>
-          <w:szCs w:val="26"/>
-        </w:rPr>
-      </w:pPr>
-      <w:r>
-        <w:rPr>
-          <w:rtl w:val="0"/>
-        </w:rPr>
-      </w:r>
-    </w:p>
-    <w:p>
-      <w:pPr>
-        <w:spacing w:after="600" w:lineRule="auto"/>
+        <w:t xml:space="preserve">Malaviya National Institute of Technology (MNIT), Jaipur</w:t>
+      </w:r>
+      <w:r>
+        <w:rPr>
+          <w:rtl w:val="0"/>
+        </w:rPr>
+      </w:r>
+    </w:p>
+    <w:p>
+      <w:pPr>
+        <w:spacing w:after="120" w:lineRule="auto"/>
         <w:jc w:val="center"/>
         <w:rPr>
           <w:sz w:val="26"/>
@@ -107,33 +226,128 @@
           <w:szCs w:val="26"/>
           <w:rtl w:val="0"/>
         </w:rPr>
-        <w:t xml:space="preserve">Summer Internship Project Report</w:t>
-      </w:r>
-      <w:r>
-        <w:rPr>
-          <w:rtl w:val="0"/>
-        </w:rPr>
-      </w:r>
-    </w:p>
-    <w:p>
-      <w:pPr>
-        <w:spacing w:after="300" w:lineRule="auto"/>
+        <w:t xml:space="preserve">Katta Sreeja Meharani (ID No. 23251A6750)</w:t>
+      </w:r>
+      <w:r>
+        <w:rPr>
+          <w:rtl w:val="0"/>
+        </w:rPr>
+      </w:r>
+    </w:p>
+    <w:p w14:paraId="0000000Aa">
+      <w:pPr>
+        <w:spacing w:after="120" w:lineRule="auto"/>
         <w:jc w:val="center"/>
         <w:rPr>
-          <w:rFonts w:ascii="Calibri" w:cs="Calibri" w:eastAsia="Calibri" w:hAnsi="Calibri"/>
           <w:sz w:val="26"/>
           <w:szCs w:val="26"/>
         </w:rPr>
       </w:pPr>
       <w:r>
         <w:rPr>
-          <w:rtl w:val="0"/>
-        </w:rPr>
-      </w:r>
-    </w:p>
-    <w:p>
-      <w:pPr>
-        <w:spacing w:after="300" w:lineRule="auto"/>
+          <w:rFonts w:ascii="Calibri" w:cs="Calibri" w:eastAsia="Calibri" w:hAnsi="Calibri"/>
+          <w:sz w:val="26"/>
+          <w:szCs w:val="26"/>
+          <w:rtl w:val="0"/>
+        </w:rPr>
+        <w:t xml:space="preserve">BTech 3rd year CSE (Data Science)</w:t>
+      </w:r>
+    </w:p>
+    <w:p>
+      <w:pPr>
+        <w:spacing w:after="400" w:lineRule="auto"/>
+        <w:jc w:val="center"/>
+        <w:rPr>
+          <w:sz w:val="26"/>
+          <w:szCs w:val="26"/>
+        </w:rPr>
+      </w:pPr>
+      <w:r>
+        <w:rPr>
+          <w:rFonts w:ascii="Calibri" w:cs="Calibri" w:eastAsia="Calibri" w:hAnsi="Calibri"/>
+          <w:b w:val="0"/>
+          <w:bCs w:val="0"/>
+          <w:i w:val="1"/>
+          <w:iCs w:val="1"/>
+          <w:sz w:val="26"/>
+          <w:szCs w:val="26"/>
+          <w:rtl w:val="0"/>
+        </w:rPr>
+        <w:t xml:space="preserve">G. Narayanamma Institute of Technology and Science (GNITS), Hyderabad</w:t>
+      </w:r>
+      <w:r>
+        <w:rPr>
+          <w:rtl w:val="0"/>
+        </w:rPr>
+      </w:r>
+    </w:p>
+    <w:p>
+      <w:pPr>
+        <w:spacing w:after="200" w:lineRule="auto"/>
+        <w:jc w:val="center"/>
+        <w:rPr>
+          <w:rFonts w:ascii="Calibri" w:cs="Calibri" w:eastAsia="Calibri" w:hAnsi="Calibri"/>
+          <w:b w:val="1"/>
+          <w:bCs w:val="1"/>
+          <w:sz w:val="26"/>
+          <w:szCs w:val="26"/>
+        </w:rPr>
+      </w:pPr>
+      <w:r>
+        <w:rPr>
+          <w:rtl w:val="0"/>
+        </w:rPr>
+      </w:r>
+    </w:p>
+    <w:p>
+      <w:pPr>
+        <w:spacing w:after="200" w:lineRule="auto"/>
+        <w:jc w:val="center"/>
+        <w:rPr>
+          <w:rFonts w:ascii="Calibri" w:cs="Calibri" w:eastAsia="Calibri" w:hAnsi="Calibri"/>
+          <w:b w:val="1"/>
+          <w:bCs w:val="1"/>
+          <w:sz w:val="26"/>
+          <w:szCs w:val="26"/>
+        </w:rPr>
+      </w:pPr>
+      <w:r>
+        <w:rPr>
+          <w:rtl w:val="0"/>
+        </w:rPr>
+      </w:r>
+    </w:p>
+    <w:p>
+      <w:pPr>
+        <w:spacing w:after="200" w:lineRule="auto"/>
+        <w:jc w:val="center"/>
+        <w:rPr>
+          <w:sz w:val="26"/>
+          <w:szCs w:val="26"/>
+        </w:rPr>
+      </w:pPr>
+      <w:r>
+        <w:rPr>
+          <w:rFonts w:ascii="Calibri" w:cs="Calibri" w:eastAsia="Calibri" w:hAnsi="Calibri"/>
+          <w:b w:val="1"/>
+          <w:bCs w:val="1"/>
+          <w:i w:val="0"/>
+          <w:iCs w:val="0"/>
+          <w:sz w:val="26"/>
+          <w:szCs w:val="26"/>
+          <w:rtl w:val="0"/>
+        </w:rPr>
+        <w:t xml:space="preserve">Project Guidance</w:t>
+      </w:r>
+      <w:r>
+        <w:rPr>
+          <w:rtl w:val="0"/>
+        </w:rPr>
+      </w:r>
+    </w:p>
+    <w:p>
+      <w:pPr>
+        <w:spacing w:after="200" w:lineRule="auto"/>
         <w:jc w:val="center"/>
         <w:rPr>
           <w:sz w:val="26"/>
@@ -151,193 +365,17 @@
           <w:szCs w:val="26"/>
           <w:rtl w:val="0"/>
         </w:rPr>
-        <w:t xml:space="preserve">by</w:t>
-      </w:r>
-      <w:r>
-        <w:rPr>
-          <w:rtl w:val="0"/>
-        </w:rPr>
-      </w:r>
-    </w:p>
-    <w:p>
-      <w:pPr>
-        <w:spacing w:after="120" w:lineRule="auto"/>
-        <w:jc w:val="center"/>
-        <w:rPr>
-          <w:sz w:val="26"/>
-          <w:szCs w:val="26"/>
-        </w:rPr>
-      </w:pPr>
-      <w:r>
-        <w:rPr>
-          <w:rFonts w:ascii="Calibri" w:cs="Calibri" w:eastAsia="Calibri" w:hAnsi="Calibri"/>
-          <w:b w:val="1"/>
-          <w:bCs w:val="1"/>
-          <w:i w:val="0"/>
-          <w:iCs w:val="0"/>
-          <w:sz w:val="26"/>
-          <w:szCs w:val="26"/>
-          <w:rtl w:val="0"/>
-        </w:rPr>
-        <w:t xml:space="preserve">Pathi Jahnavi(Team Lead)</w:t>
-      </w:r>
-      <w:r>
-        <w:rPr>
-          <w:rtl w:val="0"/>
-        </w:rPr>
-      </w:r>
-    </w:p>
-    <w:p>
-      <w:pPr>
-        <w:spacing w:after="240" w:lineRule="auto"/>
-        <w:jc w:val="center"/>
-        <w:rPr>
-          <w:sz w:val="26"/>
-          <w:szCs w:val="26"/>
-        </w:rPr>
-      </w:pPr>
-      <w:r>
-        <w:rPr>
-          <w:rFonts w:ascii="Calibri" w:cs="Calibri" w:eastAsia="Calibri" w:hAnsi="Calibri"/>
-          <w:b w:val="0"/>
-          <w:bCs w:val="0"/>
-          <w:i w:val="1"/>
-          <w:iCs w:val="1"/>
-          <w:sz w:val="26"/>
-          <w:szCs w:val="26"/>
-          <w:rtl w:val="0"/>
-        </w:rPr>
-        <w:t xml:space="preserve">Malaviya National Institute of Technology (MNIT), Jaipur</w:t>
-      </w:r>
-      <w:r>
-        <w:rPr>
-          <w:rtl w:val="0"/>
-        </w:rPr>
-      </w:r>
-    </w:p>
-    <w:p>
-      <w:pPr>
-        <w:spacing w:after="120" w:lineRule="auto"/>
-        <w:jc w:val="center"/>
-        <w:rPr>
-          <w:sz w:val="26"/>
-          <w:szCs w:val="26"/>
-        </w:rPr>
-      </w:pPr>
-      <w:r>
-        <w:rPr>
-          <w:rFonts w:ascii="Calibri" w:cs="Calibri" w:eastAsia="Calibri" w:hAnsi="Calibri"/>
-          <w:b w:val="1"/>
-          <w:bCs w:val="1"/>
-          <w:i w:val="0"/>
-          <w:iCs w:val="0"/>
-          <w:sz w:val="26"/>
-          <w:szCs w:val="26"/>
-          <w:rtl w:val="0"/>
-        </w:rPr>
-        <w:t xml:space="preserve">Katta Sreeja Meharani</w:t>
-      </w:r>
-      <w:r>
-        <w:rPr>
-          <w:rtl w:val="0"/>
-        </w:rPr>
-      </w:r>
-    </w:p>
-    <w:p>
-      <w:pPr>
-        <w:spacing w:after="400" w:lineRule="auto"/>
-        <w:jc w:val="center"/>
-        <w:rPr>
-          <w:sz w:val="26"/>
-          <w:szCs w:val="26"/>
-        </w:rPr>
-      </w:pPr>
-      <w:r>
-        <w:rPr>
-          <w:rFonts w:ascii="Calibri" w:cs="Calibri" w:eastAsia="Calibri" w:hAnsi="Calibri"/>
-          <w:b w:val="0"/>
-          <w:bCs w:val="0"/>
-          <w:i w:val="1"/>
-          <w:iCs w:val="1"/>
-          <w:sz w:val="26"/>
-          <w:szCs w:val="26"/>
-          <w:rtl w:val="0"/>
-        </w:rPr>
-        <w:t xml:space="preserve">G. Narayanamma Institute of Technology and Science (GNITS), Hyderabad</w:t>
-      </w:r>
-      <w:r>
-        <w:rPr>
-          <w:rtl w:val="0"/>
-        </w:rPr>
-      </w:r>
-    </w:p>
-    <w:p>
-      <w:pPr>
-        <w:spacing w:after="200" w:lineRule="auto"/>
-        <w:jc w:val="center"/>
-        <w:rPr>
-          <w:rFonts w:ascii="Calibri" w:cs="Calibri" w:eastAsia="Calibri" w:hAnsi="Calibri"/>
-          <w:b w:val="1"/>
-          <w:bCs w:val="1"/>
-          <w:sz w:val="26"/>
-          <w:szCs w:val="26"/>
-        </w:rPr>
-      </w:pPr>
-      <w:r>
-        <w:rPr>
-          <w:rtl w:val="0"/>
-        </w:rPr>
-      </w:r>
-    </w:p>
-    <w:p>
-      <w:pPr>
-        <w:spacing w:after="200" w:lineRule="auto"/>
-        <w:jc w:val="center"/>
-        <w:rPr>
-          <w:rFonts w:ascii="Calibri" w:cs="Calibri" w:eastAsia="Calibri" w:hAnsi="Calibri"/>
-          <w:b w:val="1"/>
-          <w:bCs w:val="1"/>
-          <w:sz w:val="26"/>
-          <w:szCs w:val="26"/>
-        </w:rPr>
-      </w:pPr>
-      <w:r>
-        <w:rPr>
-          <w:rtl w:val="0"/>
-        </w:rPr>
-      </w:r>
-    </w:p>
-    <w:p>
-      <w:pPr>
-        <w:spacing w:after="200" w:lineRule="auto"/>
-        <w:jc w:val="center"/>
-        <w:rPr>
-          <w:sz w:val="26"/>
-          <w:szCs w:val="26"/>
-        </w:rPr>
-      </w:pPr>
-      <w:r>
-        <w:rPr>
-          <w:rFonts w:ascii="Calibri" w:cs="Calibri" w:eastAsia="Calibri" w:hAnsi="Calibri"/>
-          <w:b w:val="1"/>
-          <w:bCs w:val="1"/>
-          <w:i w:val="0"/>
-          <w:iCs w:val="0"/>
-          <w:sz w:val="26"/>
-          <w:szCs w:val="26"/>
-          <w:rtl w:val="0"/>
-        </w:rPr>
-        <w:t xml:space="preserve">Project Guidance</w:t>
-      </w:r>
-      <w:r>
-        <w:rPr>
-          <w:rtl w:val="0"/>
-        </w:rPr>
-      </w:r>
-    </w:p>
-    <w:p>
-      <w:pPr>
-        <w:spacing w:after="200" w:lineRule="auto"/>
+        <w:t xml:space="preserve">MPPLAB (NSM Project) Experts</w:t>
+      </w:r>
+      <w:r>
+        <w:rPr>
+          <w:rtl w:val="0"/>
+        </w:rPr>
+      </w:r>
+    </w:p>
+    <w:p>
+      <w:pPr>
+        <w:spacing w:after="500" w:lineRule="auto"/>
         <w:jc w:val="center"/>
         <w:rPr>
           <w:sz w:val="26"/>
@@ -355,7 +393,7 @@
           <w:szCs w:val="26"/>
           <w:rtl w:val="0"/>
         </w:rPr>
-        <w:t xml:space="preserve">by</w:t>
+        <w:t xml:space="preserve">Centre for Development of Advanced Computing (C-DAC), Pune</w:t>
       </w:r>
       <w:r>
         <w:rPr>
@@ -368,23 +406,27 @@
         <w:spacing w:after="120" w:lineRule="auto"/>
         <w:jc w:val="center"/>
         <w:rPr>
+          <w:rFonts w:ascii="Calibri" w:cs="Calibri" w:eastAsia="Calibri" w:hAnsi="Calibri"/>
           <w:sz w:val="26"/>
           <w:szCs w:val="26"/>
         </w:rPr>
       </w:pPr>
       <w:r>
         <w:rPr>
-          <w:rFonts w:ascii="Calibri" w:cs="Calibri" w:eastAsia="Calibri" w:hAnsi="Calibri"/>
-          <w:b w:val="1"/>
-          <w:bCs w:val="1"/>
-          <w:i w:val="0"/>
-          <w:iCs w:val="0"/>
+          <w:rtl w:val="0"/>
+        </w:rPr>
+      </w:r>
+    </w:p>
+    <w:p>
+      <w:pPr>
+        <w:spacing w:after="120" w:lineRule="auto"/>
+        <w:jc w:val="center"/>
+        <w:rPr>
+          <w:rFonts w:ascii="Calibri" w:cs="Calibri" w:eastAsia="Calibri" w:hAnsi="Calibri"/>
           <w:sz w:val="26"/>
           <w:szCs w:val="26"/>
-          <w:rtl w:val="0"/>
-        </w:rPr>
-        <w:t xml:space="preserve">Dr. V. C. V. Rao</w:t>
-      </w:r>
+        </w:rPr>
+      </w:pPr>
       <w:r>
         <w:rPr>
           <w:rtl w:val="0"/>
@@ -411,94 +453,6 @@
           <w:szCs w:val="26"/>
           <w:rtl w:val="0"/>
         </w:rPr>
-        <w:t xml:space="preserve">MPPLAB (NSM Project) Staff,</w:t>
-      </w:r>
-      <w:r>
-        <w:rPr>
-          <w:rtl w:val="0"/>
-        </w:rPr>
-      </w:r>
-    </w:p>
-    <w:p>
-      <w:pPr>
-        <w:spacing w:after="500" w:lineRule="auto"/>
-        <w:jc w:val="center"/>
-        <w:rPr>
-          <w:sz w:val="26"/>
-          <w:szCs w:val="26"/>
-        </w:rPr>
-      </w:pPr>
-      <w:r>
-        <w:rPr>
-          <w:rFonts w:ascii="Calibri" w:cs="Calibri" w:eastAsia="Calibri" w:hAnsi="Calibri"/>
-          <w:b w:val="0"/>
-          <w:bCs w:val="0"/>
-          <w:i w:val="0"/>
-          <w:iCs w:val="0"/>
-          <w:sz w:val="26"/>
-          <w:szCs w:val="26"/>
-          <w:rtl w:val="0"/>
-        </w:rPr>
-        <w:t xml:space="preserve">Centre for Development of Advanced Computing (C-DAC), Pune</w:t>
-      </w:r>
-      <w:r>
-        <w:rPr>
-          <w:rtl w:val="0"/>
-        </w:rPr>
-      </w:r>
-    </w:p>
-    <w:p>
-      <w:pPr>
-        <w:spacing w:after="120" w:lineRule="auto"/>
-        <w:jc w:val="center"/>
-        <w:rPr>
-          <w:rFonts w:ascii="Calibri" w:cs="Calibri" w:eastAsia="Calibri" w:hAnsi="Calibri"/>
-          <w:sz w:val="26"/>
-          <w:szCs w:val="26"/>
-        </w:rPr>
-      </w:pPr>
-      <w:r>
-        <w:rPr>
-          <w:rtl w:val="0"/>
-        </w:rPr>
-      </w:r>
-    </w:p>
-    <w:p>
-      <w:pPr>
-        <w:spacing w:after="120" w:lineRule="auto"/>
-        <w:jc w:val="center"/>
-        <w:rPr>
-          <w:rFonts w:ascii="Calibri" w:cs="Calibri" w:eastAsia="Calibri" w:hAnsi="Calibri"/>
-          <w:sz w:val="26"/>
-          <w:szCs w:val="26"/>
-        </w:rPr>
-      </w:pPr>
-      <w:r>
-        <w:rPr>
-          <w:rtl w:val="0"/>
-        </w:rPr>
-      </w:r>
-    </w:p>
-    <w:p>
-      <w:pPr>
-        <w:spacing w:after="120" w:lineRule="auto"/>
-        <w:jc w:val="center"/>
-        <w:rPr>
-          <w:sz w:val="26"/>
-          <w:szCs w:val="26"/>
-        </w:rPr>
-      </w:pPr>
-      <w:r>
-        <w:rPr>
-          <w:rFonts w:ascii="Calibri" w:cs="Calibri" w:eastAsia="Calibri" w:hAnsi="Calibri"/>
-          <w:b w:val="0"/>
-          <w:bCs w:val="0"/>
-          <w:i w:val="0"/>
-          <w:iCs w:val="0"/>
-          <w:sz w:val="26"/>
-          <w:szCs w:val="26"/>
-          <w:rtl w:val="0"/>
-        </w:rPr>
         <w:t xml:space="preserve">May – July 2026</w:t>
       </w:r>
       <w:r>
@@ -574,6 +528,14 @@
       </w:r>
       <w:r>
         <w:rPr>
+          <w:sz w:val="20"/>
+          <w:szCs w:val="20"/>
+        </w:rPr>
+        <w:tab/>
+        <w:t>3</w:t>
+      </w:r>
+      <w:r>
+        <w:rPr>
           <w:rtl w:val="0"/>
         </w:rPr>
       </w:r>
@@ -596,6 +558,14 @@
       </w:r>
       <w:r>
         <w:rPr>
+          <w:sz w:val="20"/>
+          <w:szCs w:val="20"/>
+        </w:rPr>
+        <w:tab/>
+        <w:t>3</w:t>
+      </w:r>
+      <w:r>
+        <w:rPr>
           <w:rtl w:val="0"/>
         </w:rPr>
       </w:r>
@@ -619,6 +589,14 @@
       </w:r>
       <w:r>
         <w:rPr>
+          <w:sz w:val="20"/>
+          <w:szCs w:val="20"/>
+        </w:rPr>
+        <w:tab/>
+        <w:t>3</w:t>
+      </w:r>
+      <w:r>
+        <w:rPr>
           <w:rtl w:val="0"/>
         </w:rPr>
       </w:r>
@@ -642,12 +620,11 @@
       </w:r>
       <w:r>
         <w:rPr>
-          <w:rFonts w:ascii="Calibri" w:cs="Calibri" w:eastAsia="Calibri" w:hAnsi="Calibri"/>
           <w:sz w:val="20"/>
           <w:szCs w:val="20"/>
-          <w:rtl w:val="0"/>
-        </w:rPr>
-        <w:t xml:space="preserve">3</w:t>
+        </w:rPr>
+        <w:tab/>
+        <w:t>3</w:t>
       </w:r>
       <w:r>
         <w:rPr>
@@ -673,6 +650,14 @@
       </w:r>
       <w:r>
         <w:rPr>
+          <w:sz w:val="20"/>
+          <w:szCs w:val="20"/>
+        </w:rPr>
+        <w:tab/>
+        <w:t>3</w:t>
+      </w:r>
+      <w:r>
+        <w:rPr>
           <w:rtl w:val="0"/>
         </w:rPr>
       </w:r>
@@ -695,6 +680,14 @@
       </w:r>
       <w:r>
         <w:rPr>
+          <w:sz w:val="20"/>
+          <w:szCs w:val="20"/>
+        </w:rPr>
+        <w:tab/>
+        <w:t>4</w:t>
+      </w:r>
+      <w:r>
+        <w:rPr>
           <w:rtl w:val="0"/>
         </w:rPr>
       </w:r>
@@ -717,6 +710,14 @@
       </w:r>
       <w:r>
         <w:rPr>
+          <w:sz w:val="20"/>
+          <w:szCs w:val="20"/>
+        </w:rPr>
+        <w:tab/>
+        <w:t>4</w:t>
+      </w:r>
+      <w:r>
+        <w:rPr>
           <w:rtl w:val="0"/>
         </w:rPr>
       </w:r>
@@ -739,6 +740,14 @@
       </w:r>
       <w:r>
         <w:rPr>
+          <w:sz w:val="20"/>
+          <w:szCs w:val="20"/>
+        </w:rPr>
+        <w:tab/>
+        <w:t>5</w:t>
+      </w:r>
+      <w:r>
+        <w:rPr>
           <w:rtl w:val="0"/>
         </w:rPr>
       </w:r>
@@ -762,6 +771,14 @@
       </w:r>
       <w:r>
         <w:rPr>
+          <w:sz w:val="20"/>
+          <w:szCs w:val="20"/>
+        </w:rPr>
+        <w:tab/>
+        <w:t>6</w:t>
+      </w:r>
+      <w:r>
+        <w:rPr>
           <w:rtl w:val="0"/>
         </w:rPr>
       </w:r>
@@ -785,6 +802,14 @@
       </w:r>
       <w:r>
         <w:rPr>
+          <w:sz w:val="20"/>
+          <w:szCs w:val="20"/>
+        </w:rPr>
+        <w:tab/>
+        <w:t>7</w:t>
+      </w:r>
+      <w:r>
+        <w:rPr>
           <w:rtl w:val="0"/>
         </w:rPr>
       </w:r>
@@ -808,6 +833,14 @@
       </w:r>
       <w:r>
         <w:rPr>
+          <w:sz w:val="20"/>
+          <w:szCs w:val="20"/>
+        </w:rPr>
+        <w:tab/>
+        <w:t>7</w:t>
+      </w:r>
+      <w:r>
+        <w:rPr>
           <w:rtl w:val="0"/>
         </w:rPr>
       </w:r>
@@ -830,6 +863,14 @@
       </w:r>
       <w:r>
         <w:rPr>
+          <w:sz w:val="20"/>
+          <w:szCs w:val="20"/>
+        </w:rPr>
+        <w:tab/>
+        <w:t>7</w:t>
+      </w:r>
+      <w:r>
+        <w:rPr>
           <w:rtl w:val="0"/>
         </w:rPr>
       </w:r>
@@ -852,6 +893,14 @@
       </w:r>
       <w:r>
         <w:rPr>
+          <w:sz w:val="20"/>
+          <w:szCs w:val="20"/>
+        </w:rPr>
+        <w:tab/>
+        <w:t>8</w:t>
+      </w:r>
+      <w:r>
+        <w:rPr>
           <w:rtl w:val="0"/>
         </w:rPr>
       </w:r>
@@ -875,6 +924,14 @@
       </w:r>
       <w:r>
         <w:rPr>
+          <w:sz w:val="20"/>
+          <w:szCs w:val="20"/>
+        </w:rPr>
+        <w:tab/>
+        <w:t>8</w:t>
+      </w:r>
+      <w:r>
+        <w:rPr>
           <w:rtl w:val="0"/>
         </w:rPr>
       </w:r>
@@ -898,6 +955,14 @@
       </w:r>
       <w:r>
         <w:rPr>
+          <w:sz w:val="20"/>
+          <w:szCs w:val="20"/>
+        </w:rPr>
+        <w:tab/>
+        <w:t>9</w:t>
+      </w:r>
+      <w:r>
+        <w:rPr>
           <w:rtl w:val="0"/>
         </w:rPr>
       </w:r>
@@ -920,6 +985,14 @@
       </w:r>
       <w:r>
         <w:rPr>
+          <w:sz w:val="20"/>
+          <w:szCs w:val="20"/>
+        </w:rPr>
+        <w:tab/>
+        <w:t>10</w:t>
+      </w:r>
+      <w:r>
+        <w:rPr>
           <w:rtl w:val="0"/>
         </w:rPr>
       </w:r>
@@ -942,6 +1015,14 @@
       </w:r>
       <w:r>
         <w:rPr>
+          <w:sz w:val="20"/>
+          <w:szCs w:val="20"/>
+        </w:rPr>
+        <w:tab/>
+        <w:t>10</w:t>
+      </w:r>
+      <w:r>
+        <w:rPr>
           <w:rtl w:val="0"/>
         </w:rPr>
       </w:r>
@@ -965,6 +1046,14 @@
       </w:r>
       <w:r>
         <w:rPr>
+          <w:sz w:val="20"/>
+          <w:szCs w:val="20"/>
+        </w:rPr>
+        <w:tab/>
+        <w:t>10</w:t>
+      </w:r>
+      <w:r>
+        <w:rPr>
           <w:rtl w:val="0"/>
         </w:rPr>
       </w:r>
@@ -988,6 +1077,14 @@
       </w:r>
       <w:r>
         <w:rPr>
+          <w:sz w:val="20"/>
+          <w:szCs w:val="20"/>
+        </w:rPr>
+        <w:tab/>
+        <w:t>11</w:t>
+      </w:r>
+      <w:r>
+        <w:rPr>
           <w:rtl w:val="0"/>
         </w:rPr>
       </w:r>
@@ -1011,6 +1108,14 @@
       </w:r>
       <w:r>
         <w:rPr>
+          <w:sz w:val="20"/>
+          <w:szCs w:val="20"/>
+        </w:rPr>
+        <w:tab/>
+        <w:t>11</w:t>
+      </w:r>
+      <w:r>
+        <w:rPr>
           <w:rtl w:val="0"/>
         </w:rPr>
       </w:r>
@@ -1033,6 +1138,14 @@
       </w:r>
       <w:r>
         <w:rPr>
+          <w:sz w:val="20"/>
+          <w:szCs w:val="20"/>
+        </w:rPr>
+        <w:tab/>
+        <w:t>12</w:t>
+      </w:r>
+      <w:r>
+        <w:rPr>
           <w:rtl w:val="0"/>
         </w:rPr>
       </w:r>
@@ -1056,6 +1169,14 @@
       </w:r>
       <w:r>
         <w:rPr>
+          <w:sz w:val="20"/>
+          <w:szCs w:val="20"/>
+        </w:rPr>
+        <w:tab/>
+        <w:t>12</w:t>
+      </w:r>
+      <w:r>
+        <w:rPr>
           <w:rtl w:val="0"/>
         </w:rPr>
       </w:r>
@@ -1079,6 +1200,14 @@
       </w:r>
       <w:r>
         <w:rPr>
+          <w:sz w:val="20"/>
+          <w:szCs w:val="20"/>
+        </w:rPr>
+        <w:tab/>
+        <w:t>13</w:t>
+      </w:r>
+      <w:r>
+        <w:rPr>
           <w:rtl w:val="0"/>
         </w:rPr>
       </w:r>
@@ -1132,7 +1261,7 @@
           <w:szCs w:val="21"/>
           <w:rtl w:val="0"/>
         </w:rPr>
-        <w:t xml:space="preserve">The objective of this internship project was to design, implement, and evaluate a Hybrid Telecom Stream Processing Framework capable of ingesting telecom traffic from multiple, concurrently active Data Extraction Servers (DES), using the Message Passing Interface (MPI) as the primary communication mechanism between the DES clients and a central processing node.</w:t>
+        <w:t xml:space="preserve">The objective of this internship project was to design, implement, and evaluate a Hybrid Telecom Traffic Data Stream Processing Framework capable of ingesting telecom traffic from multiple, concurrently active Data Extraction Servers (DES), using the Message Passing Interface (MPI) as the primary communication mechanism between the DES clients and a central processing node.</w:t>
       </w:r>
       <w:r>
         <w:rPr>
@@ -9561,7 +9690,7 @@
           <w:szCs w:val="21"/>
           <w:rtl w:val="0"/>
         </w:rPr>
-        <w:t xml:space="preserve">This report has presented the design, implementation, and evaluation of the Hybrid Telecom Stream Processing Framework, developed during a summer internship at MPPLAB, C-DAC Pune, under the guidance of Dr. V. C. V. Rao. The project's central achievement is an MPI-based communication layer that supports an arbitrary number of concurrently active Data Extraction Servers without modification to the server's core logic, validated across configurations ranging from one to three concurrent DES clients and from ten to three thousand packets.</w:t>
+        <w:t xml:space="preserve">This report has presented the design, implementation, and evaluation of the Hybrid Telecom Stream Processing Framework, developed during a summer internship at MPPLAB, C-DAC Pune, under the guidance of the MPPLAB (NSM Project) Experts. The project's central achievement is an MPI-based communication layer that supports an arbitrary number of concurrently active Data Extraction Servers without modification to the server's core logic, validated across configurations ranging from one to three concurrent DES clients and from ten to three thousand packets.</w:t>
       </w:r>
       <w:r>
         <w:rPr>
@@ -9833,7 +9962,7 @@
         <w:szCs w:val="16"/>
         <w:rtl w:val="0"/>
       </w:rPr>
-      <w:t xml:space="preserve">Hybrid Telecom Stream Processing Framework</w:t>
+      <w:t xml:space="preserve">Data Analysis of Streaming Telecom Traffic Data</w:t>
     </w:r>
     <w:r>
       <w:rPr>

</xml_diff>